<commit_message>
Describe the perception work on the home page and résumé, and remove the footer.
</commit_message>
<xml_diff>
--- a/public/resume/Max-Teeple-Resume.docx
+++ b/public/resume/Max-Teeple-Resume.docx
@@ -43,7 +43,7 @@
           <w:sz w:val="20"/>
           <w:szCs w:val="20"/>
         </w:rPr>
-        <w:t xml:space="preserve">Controls engineer for autonomous agricultural vehicles. The work runs from model-based control and vehicle dynamics through sensor fusion, inertial navigation, and object tracking, and it ends as embedded software on the machine.</w:t>
+        <w:t xml:space="preserve">Research engineer focused on perception, autonomy, sensor fusion, vehicle controls, and inertial navigation. Recent work covers lidar selection, wide-baseline stereo, in-house stereo algorithms, and filtering and detection on 3D sensor data.</w:t>
       </w:r>
     </w:p>
     <w:p>
@@ -127,7 +127,7 @@
           <w:sz w:val="20"/>
           <w:szCs w:val="20"/>
         </w:rPr>
-        <w:t xml:space="preserve">Lead control development for autonomous and semi-autonomous agricultural vehicles, from a simulated strategy to software running on the machine.</w:t>
+        <w:t xml:space="preserve">Own sensor selection for perception, benchmarking lidar systems and OEMs for autonomous and semi-autonomous agricultural vehicles.</w:t>
       </w:r>
     </w:p>
     <w:p>
@@ -146,7 +146,7 @@
           <w:sz w:val="20"/>
           <w:szCs w:val="20"/>
         </w:rPr>
-        <w:t xml:space="preserve">Design, simulate, and tune model-based controllers so the vehicle tracks its path and stays composed as speed, load, and the plan change.</w:t>
+        <w:t xml:space="preserve">Specify wide-baseline stereo and develop the in-house stereo algorithms that run on the vehicle.</w:t>
       </w:r>
     </w:p>
     <w:p>
@@ -165,7 +165,7 @@
           <w:sz w:val="20"/>
           <w:szCs w:val="20"/>
         </w:rPr>
-        <w:t xml:space="preserve">Close guidance on a fused navigation estimate built from inertial sensors and the rest of the navigation stack.</w:t>
+        <w:t xml:space="preserve">Take 3D sensor data through filtering and detection so the autonomy stack has structure and tracks it can use.</w:t>
       </w:r>
     </w:p>
     <w:p>
@@ -184,7 +184,7 @@
           <w:sz w:val="20"/>
           <w:szCs w:val="20"/>
         </w:rPr>
-        <w:t xml:space="preserve">Bring object tracks into the control problem, so what the vehicle perceives can change how it moves.</w:t>
+        <w:t xml:space="preserve">Design, simulate, and tune model-based vehicle controllers, and carry that software onto the machine.</w:t>
       </w:r>
     </w:p>
     <w:p>
@@ -203,7 +203,7 @@
           <w:sz w:val="20"/>
           <w:szCs w:val="20"/>
         </w:rPr>
-        <w:t xml:space="preserve">Integrate that embedded stack into production platforms with the teams who own the machine, the sensors, and the perception software.</w:t>
+        <w:t xml:space="preserve">Integrate the perception and control stack into production platforms with the teams around the vehicle.</w:t>
       </w:r>
     </w:p>
     <w:p>
@@ -266,7 +266,7 @@
           <w:sz w:val="20"/>
           <w:szCs w:val="20"/>
         </w:rPr>
-        <w:t xml:space="preserve">Developed and validated embedded control software for real-time operation on precision-agriculture systems.</w:t>
+        <w:t xml:space="preserve">Developed a loosely coupled inertial navigation system from chip selection through product launch.</w:t>
       </w:r>
     </w:p>
     <w:p>
@@ -285,7 +285,7 @@
           <w:sz w:val="20"/>
           <w:szCs w:val="20"/>
         </w:rPr>
-        <w:t xml:space="preserve">Modeled vehicle guidance and stability, including the inertial-navigation and sensor-fusion path the controller depends on.</w:t>
+        <w:t xml:space="preserve">Built the sensor-fusion path the navigation estimate depends on, and validated the embedded software in real time on precision-agriculture machines.</w:t>
       </w:r>
     </w:p>
     <w:p>
@@ -304,7 +304,7 @@
           <w:sz w:val="20"/>
           <w:szCs w:val="20"/>
         </w:rPr>
-        <w:t xml:space="preserve">Supported autonomy research on vehicle dynamics: how the platform should respond as the mission and the scene change.</w:t>
+        <w:t xml:space="preserve">Modeled vehicle guidance and stability around that navigation solution.</w:t>
       </w:r>
     </w:p>
     <w:p>
@@ -807,7 +807,7 @@
           <w:sz w:val="20"/>
           <w:szCs w:val="20"/>
         </w:rPr>
-        <w:t xml:space="preserve">Autonomy, model-based design, control systems, vehicle dynamics, inertial navigation, sensor fusion, and object tracking</w:t>
+        <w:t xml:space="preserve">Perception, autonomy, lidar and stereo, 3D filtering and detection, sensor fusion, inertial navigation, and vehicle controls</w:t>
       </w:r>
     </w:p>
     <w:sectPr>

</xml_diff>

<commit_message>
Correct the current title to Research Engineer II and rewrite the introduction.
</commit_message>
<xml_diff>
--- a/public/resume/Max-Teeple-Resume.docx
+++ b/public/resume/Max-Teeple-Resume.docx
@@ -43,7 +43,7 @@
           <w:sz w:val="20"/>
           <w:szCs w:val="20"/>
         </w:rPr>
-        <w:t xml:space="preserve">Research engineer focused on perception, autonomy, sensor fusion, vehicle controls, and inertial navigation. Recent work covers lidar selection, wide-baseline stereo, in-house stereo algorithms, and filtering and detection on 3D sensor data.</w:t>
+        <w:t xml:space="preserve">I work on perception and autonomy for agricultural machines: how they see, where they are, and how they steer. Lately that has been lidar benchmarking, wide-baseline stereo and the algorithms we write for it, and filtering and detection on 3D sensor data.</w:t>
       </w:r>
     </w:p>
     <w:p>
@@ -83,7 +83,7 @@
           <w:sz w:val="21"/>
           <w:szCs w:val="21"/>
         </w:rPr>
-        <w:t xml:space="preserve">Controls Engineer II</w:t>
+        <w:t xml:space="preserve">Research Engineer II</w:t>
       </w:r>
       <w:r>
         <w:rPr>

</xml_diff>